<commit_message>
update to light imports
</commit_message>
<xml_diff>
--- a/output/tables/table_summary.docx
+++ b/output/tables/table_summary.docx
@@ -185,7 +185,7 @@
                 <w:rFonts w:ascii="Calibri" w:hAnsi="Calibri"/>
                 <w:sz w:val="20"/>
               </w:rPr>
-              <w:t xml:space="default">&lt;strong&gt;38&lt;/strong&gt; </w:t>
+              <w:t xml:space="default">&lt;strong&gt;39&lt;/strong&gt; </w:t>
             </w:r>
           </w:p>
         </w:tc>
@@ -286,7 +286,7 @@
                 <w:rFonts w:ascii="Calibri" w:hAnsi="Calibri"/>
                 <w:sz w:val="20"/>
               </w:rPr>
-              <w:t xml:space="default">&lt;strong&gt;304&lt;/strong&gt; (8 - 8)</w:t>
+              <w:t xml:space="default">&lt;strong&gt;312&lt;/strong&gt; (8 - 8)</w:t>
             </w:r>
           </w:p>
         </w:tc>
@@ -387,7 +387,7 @@
                 <w:rFonts w:ascii="Calibri" w:hAnsi="Calibri"/>
                 <w:sz w:val="20"/>
               </w:rPr>
-              <w:t xml:space="default">&lt;strong&gt;229&lt;/strong&gt; (6 - 7)</w:t>
+              <w:t xml:space="default">&lt;strong&gt;235&lt;/strong&gt; (6 - 7)</w:t>
             </w:r>
           </w:p>
         </w:tc>
@@ -742,7 +742,7 @@
                 <w:rFonts w:ascii="Calibri" w:hAnsi="Calibri"/>
                 <w:sz w:val="20"/>
               </w:rPr>
-              <w:t xml:space="default">&lt;strong&gt;9,142&lt;/strong&gt; ±9,773 (188 - 71,715)</w:t>
+              <w:t xml:space="default">&lt;strong&gt;9,205&lt;/strong&gt; ±9,674 (188 - 71,715)</w:t>
             </w:r>
           </w:p>
         </w:tc>
@@ -852,7 +852,7 @@
                 <w:rFonts w:ascii="Calibri" w:hAnsi="Calibri"/>
                 <w:sz w:val="20"/>
               </w:rPr>
-              <w:t xml:space="default">&lt;strong&gt;2h 50m&lt;/strong&gt; ±2h 7m (40s - 9h 7m)</w:t>
+              <w:t xml:space="default">&lt;strong&gt;2h 54m&lt;/strong&gt; ±2h 8m (40s - 9h 7m)</w:t>
             </w:r>
           </w:p>
         </w:tc>
@@ -962,7 +962,7 @@
                 <w:rFonts w:ascii="Calibri" w:hAnsi="Calibri"/>
                 <w:sz w:val="20"/>
               </w:rPr>
-              <w:t xml:space="default">&lt;strong&gt;2h 56m&lt;/strong&gt; ±1h 46m (6m 20s - 10h 8m)</w:t>
+              <w:t xml:space="default">&lt;strong&gt;2h 54m&lt;/strong&gt; ±1h 45m (6m 20s - 10h 8m)</w:t>
             </w:r>
           </w:p>
         </w:tc>
@@ -1072,7 +1072,7 @@
                 <w:rFonts w:ascii="Calibri" w:hAnsi="Calibri"/>
                 <w:sz w:val="20"/>
               </w:rPr>
-              <w:t xml:space="default">&lt;strong&gt;10h 6m&lt;/strong&gt; ±2h 33m (2h 41m - 21h 44m)</w:t>
+              <w:t xml:space="default">&lt;strong&gt;10h 6m&lt;/strong&gt; ±2h 32m (2h 41m - 21h 44m)</w:t>
             </w:r>
           </w:p>
         </w:tc>
@@ -1182,7 +1182,7 @@
                 <w:rFonts w:ascii="Calibri" w:hAnsi="Calibri"/>
                 <w:sz w:val="20"/>
               </w:rPr>
-              <w:t xml:space="default">&lt;strong&gt;32m 24s&lt;/strong&gt; ±32m 21s (10s - 4h 27m)</w:t>
+              <w:t xml:space="default">&lt;strong&gt;33m 14s&lt;/strong&gt; ±32m 44s (10s - 4h 27m)</w:t>
             </w:r>
           </w:p>
         </w:tc>
@@ -1292,7 +1292,7 @@
                 <w:rFonts w:ascii="Calibri" w:hAnsi="Calibri"/>
                 <w:sz w:val="20"/>
               </w:rPr>
-              <w:t xml:space="default">&lt;strong&gt;1h 17m&lt;/strong&gt; ±1h 17m (0s - 6h 10m)</w:t>
+              <w:t xml:space="default">&lt;strong&gt;1h 19m&lt;/strong&gt; ±1h 18m (0s - 6h 10m)</w:t>
             </w:r>
           </w:p>
         </w:tc>
@@ -1402,7 +1402,7 @@
                 <w:rFonts w:ascii="Calibri" w:hAnsi="Calibri"/>
                 <w:sz w:val="20"/>
               </w:rPr>
-              <w:t xml:space="default">&lt;strong&gt;07:33&lt;/strong&gt; ±02:09 (00:01 - 12:08)</w:t>
+              <w:t xml:space="default">&lt;strong&gt;07:32&lt;/strong&gt; ±02:08 (00:01 - 12:08)</w:t>
             </w:r>
           </w:p>
         </w:tc>
@@ -1521,7 +1521,7 @@
                 <w:rFonts w:ascii="Calibri" w:hAnsi="Calibri"/>
                 <w:sz w:val="20"/>
               </w:rPr>
-              <w:t xml:space="default">&lt;strong&gt;12:08&lt;/strong&gt; ±01:28 (06:14 - 16:14)</w:t>
+              <w:t xml:space="default">&lt;strong&gt;12:07&lt;/strong&gt; ±01:28 (06:14 - 16:14)</w:t>
             </w:r>
           </w:p>
         </w:tc>
@@ -1640,7 +1640,7 @@
                 <w:rFonts w:ascii="Calibri" w:hAnsi="Calibri"/>
                 <w:sz w:val="20"/>
               </w:rPr>
-              <w:t xml:space="default">&lt;strong&gt;18:06&lt;/strong&gt; ±02:41 (07:46 - 23:51)</w:t>
+              <w:t xml:space="default">&lt;strong&gt;18:04&lt;/strong&gt; ±02:40 (07:46 - 23:51)</w:t>
             </w:r>
           </w:p>
         </w:tc>
@@ -1759,7 +1759,7 @@
                 <w:rFonts w:ascii="Calibri" w:hAnsi="Calibri"/>
                 <w:sz w:val="20"/>
               </w:rPr>
-              <w:t xml:space="default">&lt;strong&gt;13:00&lt;/strong&gt; ±01:51 (05:38 - 18:59)</w:t>
+              <w:t xml:space="default">&lt;strong&gt;12:58&lt;/strong&gt; ±01:51 (05:38 - 18:59)</w:t>
             </w:r>
           </w:p>
         </w:tc>
@@ -1878,7 +1878,7 @@
                 <w:rFonts w:ascii="Calibri" w:hAnsi="Calibri"/>
                 <w:sz w:val="20"/>
               </w:rPr>
-              <w:t xml:space="default">&lt;strong&gt;03:15&lt;/strong&gt; ±03:20 (00:07 - 23:55)</w:t>
+              <w:t xml:space="default">&lt;strong&gt;03:13&lt;/strong&gt; ±03:18 (00:07 - 23:55)</w:t>
             </w:r>
           </w:p>
         </w:tc>
@@ -2013,7 +2013,7 @@
                 <w:rFonts w:ascii="Calibri" w:hAnsi="Calibri"/>
                 <w:sz w:val="20"/>
               </w:rPr>
-              <w:t xml:space="default">&lt;strong&gt;117.8&lt;/strong&gt; ±142.4 (0.1 - 883.4)</w:t>
+              <w:t xml:space="default">&lt;strong&gt;119.9&lt;/strong&gt; ±142.7 (0.1 - 883.4)</w:t>
             </w:r>
           </w:p>
         </w:tc>
@@ -2240,7 +2240,7 @@
                 <w:rFonts w:ascii="Calibri" w:hAnsi="Calibri"/>
                 <w:sz w:val="20"/>
               </w:rPr>
-              <w:t xml:space="default">&lt;strong&gt;0.290&lt;/strong&gt; ±0.069 (0.159 - 0.450)</w:t>
+              <w:t xml:space="default">&lt;strong&gt;0.293&lt;/strong&gt; ±0.070 (0.159 - 0.450)</w:t>
             </w:r>
           </w:p>
         </w:tc>
@@ -2341,7 +2341,7 @@
                 <w:rFonts w:ascii="Calibri" w:hAnsi="Calibri"/>
                 <w:sz w:val="20"/>
               </w:rPr>
-              <w:t xml:space="default">&lt;strong&gt;1.228&lt;/strong&gt; ±0.319 (0.470 - 1.888)</w:t>
+              <w:t xml:space="default">&lt;strong&gt;1.224&lt;/strong&gt; ±0.316 (0.470 - 1.888)</w:t>
             </w:r>
           </w:p>
         </w:tc>
@@ -2452,7 +2452,7 @@
                 <w:rFonts w:ascii="Calibri" w:hAnsi="Calibri"/>
                 <w:sz w:val="20"/>
               </w:rPr>
-              <w:t xml:space="default">Metrics are calculated on a by-participant-day basis (n=229) with the exception of IV and IS, which are calculated on a by-participant basis (n=38).</w:t>
+              <w:t xml:space="default">Metrics are calculated on a by-participant-day basis (n=235) with the exception of IV and IS, which are calculated on a by-participant basis (n=39).</w:t>
             </w:r>
           </w:p>
         </w:tc>

</xml_diff>